<commit_message>
Add BERT-small training and evaluation with revised reports
</commit_message>
<xml_diff>
--- a/reports/summaries/classical/modeling_ablation_results_report.docx
+++ b/reports/summaries/classical/modeling_ablation_results_report.docx
@@ -4,7 +4,7 @@
   <ns0:body>
     <ns0:p>
       <ns0:r>
-        <ns0:t>Ghi chú sau tuần 1 (23/10/2026): tài liệu này giữ kết quả và trạng thái lịch sử mốc 20/10. Kết quả audit, sensitivity và BERT-small mới xem contextual_model_validation_report.docx; trạng thái hiện hành xem status.md. Test chưa chấm.</ns0:t>
+        <ns0:t>Báo cáo trình bày kết quả validation tại mốc 20/10/2026. Các bổ sung ngày 23/10/2026 và kết quả BERT về sau được đọc cùng README của nhóm báo cáo; trạng thái hiện tại nằm trong docs/status.md. Những câu nói test chưa được đánh giá trong tài liệu này thuộc thời điểm thực nghiệm ban đầu.</ns0:t>
       </ns0:r>
     </ns0:p>
     <ns0:p>
@@ -12,7 +12,7 @@
         <ns0:pStyle ns0:val="Title"/>
       </ns0:pPr>
       <ns0:r>
-        <ns0:t xml:space="preserve">ĐẶC TRƯNG, HUẤN LUYỆN VÀ PHÂN TÍCH KẾT QUẢ</ns0:t>
+        <ns0:t>Đặc trưng, huấn luyện và phân tích kết quả</ns0:t>
       </ns0:r>
     </ns0:p>
     <ns0:p>
@@ -30,7 +30,7 @@
     </ns0:p>
     <ns0:p>
       <ns0:r>
-        <ns0:t xml:space="preserve">Tài liệu được viết từ mã nguồn và artifact thực nghiệm hiện có; không chạy lại huấn luyện hoặc chấm test khi lập báo cáo. Mọi điểm số là validation trừ khi ghi rõ train. test_scored=false trong các báo cáo được đối chiếu. Các giả thuyết giải thích nguyên nhân được phân biệt với kết quả đo trực tiếp.</ns0:t>
+        <ns0:t>Báo cáo tổng hợp mã nguồn và các kết quả thực nghiệm đã lưu, không thực hiện lại huấn luyện hoặc đánh giá test. Các điểm số bên dưới là validation, trừ những chỗ ghi rõ train. Thông tin test_scored=false phản ánh phạm vi của các tệp được đối chiếu. Các phần giải thích nguyên nhân được trình bày như giả thuyết khi chưa có phép kiểm trực tiếp.</ns0:t>
       </ns0:r>
     </ns0:p>
     <ns0:p>
@@ -53,17 +53,17 @@
     </ns0:p>
     <ns0:p>
       <ns0:r>
-        <ns0:t xml:space="preserve">Sau preprocessing, dự án có 15.788 mẫu thuộc năm nhãn, chia theo nhóm essay: 11.052 train, 2.368 validation và 2.368 test. Encoder học từ train; validation dùng chọn cấu hình. Thí nghiệm so sánh Majority, POS rule, Logistic Regression và Decision Tree; ablation gồm sáu variant với cùng grid tương ứng cho mỗi model.</ns0:t>
-      </ns0:r>
-    </ns0:p>
-    <ns0:p>
-      <ns0:r>
-        <ns0:t xml:space="preserve">LR Full đạt Macro-F1 0,8067, cao nhất trong các variant LR đã chạy. Tree Full đạt 0,7879, nhưng Tree tốt nhất là S+L+P+M đạt 0,7929. POS rule đạt 0,7048 và Majority đạt 0,1184. POS tạo mức tăng lớn nhất trong chuỗi thêm feature. Bỏ lexical chỉ làm giảm nhẹ Macro-F1 tổng thể, nhưng ảnh hưởng không đồng đều giữa các lớp.</ns0:t>
-      </ns0:r>
-    </ns0:p>
-    <ns0:p>
-      <ns0:r>
-        <ns0:t xml:space="preserve">Các số liệu dưới đây là bằng chứng chọn mô hình trên validation. Chưa có khoảng tin cậy để kết luận các chênh lệch nhỏ có ý nghĩa thống kê; chưa thể coi chúng là kết quả cuối cùng trên holdout test.</ns0:t>
+        <ns0:t>Sau tiền xử lý, dữ liệu gồm 15.788 mẫu thuộc năm nhãn, chia theo nhóm bài viết thành 11.052 mẫu train, 2.368 validation và 2.368 test. Encoder chỉ học từ train; validation dùng để chọn cấu hình. Trên cùng cách chia này, báo cáo so sánh Majority, POS rule, Logistic Regression và Decision Tree, rồi xem xét sáu biến thể đặc trưng bằng cùng lưới tham số cho từng loại mô hình.</ns0:t>
+      </ns0:r>
+    </ns0:p>
+    <ns0:p>
+      <ns0:r>
+        <ns0:t>LR Full đạt macro-F1 0,8067, cao nhất trong các biến thể LR đã thử. Với Tree, kết quả Full là 0,7879, thấp hơn một chút so với S+L+P+M đạt 0,7929. Hai đối chứng POS rule và Majority lần lượt đạt 0,7048 và 0,1184. Việc thêm POS tạo mức tăng lớn nhất trong chuỗi thí nghiệm. Ngược lại, bỏ toàn bộ thông tin từ vựng chỉ làm giảm nhẹ điểm chung, dù ảnh hưởng ở từng lớp khác nhau.</ns0:t>
+      </ns0:r>
+    </ns0:p>
+    <ns0:p>
+      <ns0:r>
+        <ns0:t>Các kết quả này giúp lựa chọn mô hình trên validation. Ở thời điểm báo cáo, chưa có khoảng tin cậy để đánh giá các chênh lệch nhỏ, nên chưa coi thứ hạng validation là kết luận cuối cùng trên test.</ns0:t>
       </ns0:r>
     </ns0:p>
     <ns0:p>
@@ -76,7 +76,7 @@
     </ns0:p>
     <ns0:p>
       <ns0:r>
-        <ns0:t xml:space="preserve">Input extractor là câu gốc và character offsets của gold span. spaCy 3.8.7 với en_core_web_sm 3.8.0 cung cấp POS, morphology và dependency; NER bị tắt. Code kiểm tra Doc.text khớp câu nguồn và sentence[start:end] khớp error_span, rồi chọn các token giao span. Đây là phân loại tại vị trí lỗi đã biết, không tự phát hiện lỗi.</ns0:t>
+        <ns0:t>Bộ trích xuất nhận câu gốc và vị trí ký tự của đoạn lỗi đã được gán. spaCy 3.8.7 cùng en_core_web_sm 3.8.0 cung cấp từ loại, hình thái và quan hệ phụ thuộc; thành phần NER được tắt. Trước khi lấy đặc trưng, mã kiểm tra câu và đoạn văn bản tại các offset có khớp nguồn hay không, rồi chọn những token giao với span. Vị trí lỗi được cho trước, không do mô hình tự tìm.</ns0:t>
       </ns0:r>
     </ns0:p>
     <ns0:tbl>
@@ -384,7 +384,7 @@
     </ns0:p>
     <ns0:p>
       <ns0:r>
-        <ns0:t xml:space="preserve">TrainOnlyEncoder chỉ học vocabulary và categorical values từ train. Numeric giữ giá trị số; categorical dùng one-hot; kênh unigram/bigram dùng multi-hot hiện diện. Unknown dùng __UNK__, missing và NOT_APPLICABLE có marker riêng. Code hiện không có bước chuẩn hóa z-score cho numeric features.</ns0:t>
+        <ns0:t>TrainOnlyEncoder xây dựng từ vựng và các giá trị phân loại từ tập train. Đặc trưng số giữ nguyên giá trị; đặc trưng phân loại được mã hóa one-hot, còn sự xuất hiện unigram/bigram dùng multi-hot. Các trường hợp chưa gặp, thiếu dữ liệu và không áp dụng có marker riêng. Mã hiện tại không chuẩn hóa z-score cho đặc trưng số.</ns0:t>
       </ns0:r>
     </ns0:p>
     <ns0:p>
@@ -417,7 +417,7 @@
     </ns0:p>
     <ns0:p>
       <ns0:r>
-        <ns0:t xml:space="preserve">Majority luôn đoán ArtOrDet, lớp phổ biến nhất trong train. POS rule áp dụng ADP → Prep và DET → ArtOrDet; signature khác đã thấy thì chọn lớp đa số của signature trên train; unseen/missing/insertion fallback về Majority. POS baseline dùng POS của span, không dùng POS ngữ cảnh.</ns0:t>
+        <ns0:t>Majority luôn dự đoán ArtOrDet vì đây là lớp đông nhất trong train. POS rule dùng hai ánh xạ cố định ADP → Prep và DET → ArtOrDet. Với các POS signature khác, nó tra nhãn phổ biến nhất đã học từ train; trường hợp chưa gặp hoặc thiếu thông tin quay về Majority. Đối chứng này chỉ dùng POS của span, không dùng POS ngữ cảnh.</ns0:t>
       </ns0:r>
     </ns0:p>
     <ns0:p>
@@ -948,7 +948,7 @@
     </ns0:p>
     <ns0:p>
       <ns0:r>
-        <ns0:t xml:space="preserve">LR Full cao hơn Tree Full 0,0188. Một giả thuyết là LR kết hợp được nhiều tín hiệu thưa trong khi Tree bị giới hạn độ sâu/kích thước lá; bảng điểm chưa tự chứng minh nguyên nhân. Không suy rộng LR luôn tốt hơn Tree trên mọi grid hoặc mọi dữ liệu.</ns0:t>
+        <ns0:t>LR Full cao hơn Tree Full 0,0188 trên validation. Một cách giải thích có thể là LR kết hợp được nhiều tín hiệu thưa, trong khi Tree chịu giới hạn về độ sâu và kích thước lá. Tuy nhiên, bảng điểm chưa kiểm chứng cơ chế này; kết quả chỉ áp dụng cho dữ liệu và lưới tham số đã thử.</ns0:t>
       </ns0:r>
     </ns0:p>
     <ns0:p>
@@ -2244,7 +2244,7 @@
     </ns0:p>
     <ns0:p>
       <ns0:r>
-        <ns0:t xml:space="preserve">Full không tự động tốt nhất. LR chọn Full đứng đầu; Tree S+L+P+M đạt 0,7929, cao hơn Tree Full khoảng 0,0051. Tree thay đổi cả depth và class_weight giữa hai variant, nên chưa thể nói dependency làm giảm chất lượng nói chung.</ns0:t>
+        <ns0:t>Thêm nhiều nhóm đặc trưng không phải lúc nào cũng cho điểm cao nhất. LR chọn Full, còn Tree đạt 0,7929 với S+L+P+M, cao hơn Full khoảng 0,0051. Hai biến thể Tree cũng khác depth và class_weight, nên chênh lệch này chưa đủ để kết luận thông tin dependency làm mô hình kém đi.</ns0:t>
       </ns0:r>
     </ns0:p>
     <ns0:tbl>
@@ -2673,7 +2673,7 @@
         <ns0:pStyle ns0:val="Heading1"/>
       </ns0:pPr>
       <ns0:r>
-        <ns0:t xml:space="preserve">9. Class weighting và hội tụ</ns0:t>
+        <ns0:t>9. trọng số lớp và hội tụ</ns0:t>
       </ns0:r>
     </ns0:p>
     <ns0:p>
@@ -6392,7 +6392,7 @@
     </ns0:p>
     <ns0:p>
       <ns0:r>
-        <ns0:t xml:space="preserve">Các giới hạn dữ liệu từ phần preprocessing vẫn còn: nhãn/biên câu unresolved, partial-token và near-duplicate chưa được phát hiện theo ngữ nghĩa. POS/morphology/dependency là đầu ra parser trên văn bản lỗi. Gold span giúp bài toán hẹp hơn xử lý essay thô. Không suy kết quả thành hiệu quả học tập hay score thành confidence đã hiệu chỉnh.</ns0:t>
+        <ns0:t>Các giới hạn dữ liệu từ phần preprocessing vẫn còn: nhãn/biên câu unresolved, partial-token và near-duplicate chưa được phát hiện theo ngữ nghĩa. POS/morphology/dependency là đầu ra parser trên văn bản lỗi. đoạn lỗi được gán sẵn giúp bài toán hẹp hơn xử lý essay thô. Không suy kết quả thành hiệu quả học tập hay score thành confidence đã hiệu chỉnh.</ns0:t>
       </ns0:r>
     </ns0:p>
     <ns0:p>
@@ -11969,7 +11969,7 @@
     </ns0:p>
     <ns0:p>
       <ns0:r>
-        <ns0:t xml:space="preserve">Để phân biệt SVA và Vform, người chấm cần nhìn chủ ngữ và đặc điểm số/ngôi, động từ hữu hạn, các trợ động từ/modal, dạng infinitive/participle và cấu trúc chi phối động từ trong câu. LR hiện đã có M và D từ parse toàn câu, nên có thể lấy thông tin chủ ngữ ngoài cửa sổ lexical ±2. Hạn chế là parser có thể sai và các đặc trưng tổng hợp không biểu diễn đầy đủ mọi quan hệ. Vì vậy luận điểm cần kiểm tra là contextual representation có bổ sung cho cả L/P/M/D không, không phải LR hoàn toàn không nhìn được chủ ngữ xa.</ns0:t>
+        <ns0:t>Để phân biệt SVA và Vform, người chấm cần nhìn chủ ngữ và đặc điểm số/ngôi, động từ hữu hạn, các trợ động từ/modal, dạng infinitive/participle và cấu trúc chi phối động từ trong câu. LR hiện đã có M và D từ parse toàn câu, nên có thể lấy thông tin chủ ngữ ngoài cửa sổ lexical ± 2. Hạn chế là parser có thể sai và các đặc trưng tổng hợp không biểu diễn đầy đủ mọi quan hệ. Vì vậy luận điểm cần kiểm tra là contextual representation có bổ sung cho cả L/P/M/D không, không phải LR hoàn toàn không nhìn được chủ ngữ xa.</ns0:t>
       </ns0:r>
     </ns0:p>
     <ns0:p>

</xml_diff>